<commit_message>
Update the Word syllabus for the new Unit 14
Adds Practicing Dummy Variable Specifications as Unit 14, with its
exercise set, review links, and reference material, formatted by
cloning the Unit 12 and 13 paragraphs. Part 3 units renumber to
15-21 and the opening line now reads "Twenty-one units".

Co-Authored-By: Claude Opus 5.5 <noreply@anthropic.com>
</commit_message>
<xml_diff>
--- a/syllabus_parts.docx
+++ b/syllabus_parts.docx
@@ -23,7 +23,7 @@
           <w:sz w:val="22"/>
           <w:szCs w:val="22"/>
         </w:rPr>
-        <w:t>Twenty units across three parts: regression foundations, research design and counterfactual reasoning, and quasi-experimental estimators. Each unit lists its lectures and the reference material that goes with them.</w:t>
+        <w:t>Twenty-one units across three parts: regression foundations, research design and counterfactual reasoning, and quasi-experimental estimators. Each unit lists its lectures and the reference material that goes with them.</w:t>
       </w:r>
     </w:p>
     <w:p>
@@ -6993,7 +6993,7 @@
         </w:rPr>
         <w:t xml:space="preserve"> </w:t>
       </w:r>
-      <w:hyperlink w:anchor="interrupted-time-series" w:history="1" r:id="rId104">
+      <w:hyperlink w:anchor="dummy-variable-specifications" w:history="1" r:id="rId134">
         <w:r>
           <w:rPr>
             <w:rFonts w:ascii="Amasis MT Pro Black" w:cs="Segoe UI" w:eastAsia="Times New Roman" w:hAnsi="Amasis MT Pro Black"/>
@@ -7005,7 +7005,7 @@
             <w:szCs w:val="28"/>
             <w14:ligatures w14:val="none"/>
           </w:rPr>
-          <w:t>Interrupted Time Series</w:t>
+          <w:t>Practicing Dummy Variable Specifications</w:t>
         </w:r>
       </w:hyperlink>
     </w:p>
@@ -7031,31 +7031,7 @@
           <w:szCs w:val="22"/>
           <w14:ligatures w14:val="none"/>
         </w:rPr>
-        <w:t xml:space="preserve">Models a single unit observed many times before and after an intervention, separating the pre-existing trend from what the policy changed. The model distinguishes an immediate change in level from a sustained change in </w:t>
-      </w:r>
-      <w:proofErr w:type="gramStart"/>
-      <w:r>
-        <w:rPr>
-          <w:rFonts w:ascii="Segoe UI" w:cs="Segoe UI" w:eastAsia="Times New Roman" w:hAnsi="Segoe UI"/>
-          <w:color w:val="4D565F"/>
-          <w:kern w:val="0"/>
-          <w:sz w:val="22"/>
-          <w:szCs w:val="22"/>
-          <w14:ligatures w14:val="none"/>
-        </w:rPr>
-        <w:t>slope, and</w:t>
-      </w:r>
-      <w:proofErr w:type="gramEnd"/>
-      <w:r>
-        <w:rPr>
-          <w:rFonts w:ascii="Segoe UI" w:cs="Segoe UI" w:eastAsia="Times New Roman" w:hAnsi="Segoe UI"/>
-          <w:color w:val="4D565F"/>
-          <w:kern w:val="0"/>
-          <w:sz w:val="22"/>
-          <w:szCs w:val="22"/>
-          <w14:ligatures w14:val="none"/>
-        </w:rPr>
-        <w:t xml:space="preserve"> checks the residuals for autocorrelation.</w:t>
+        <w:t>Fourteen exercises that start from a picture of group means and a research question, and ask for the regression whose coefficient tests it. They cover t-tests as regressions, reference categories, interactions, difference-in-differences, dosage, interrupted time series, regression discontinuity, outliers, and structural breaks.</w:t>
       </w:r>
     </w:p>
     <w:p>
@@ -7098,7 +7074,7 @@
       <w:pPr>
         <w:numPr>
           <w:ilvl w:val="0"/>
-          <w:numId w:val="27"/>
+          <w:numId w:val="23"/>
         </w:numPr>
         <w:shd w:color="auto" w:fill="FFFFFF" w:val="clear"/>
         <w:spacing w:after="100" w:afterAutospacing="1" w:before="100" w:beforeAutospacing="1" w:line="240" w:lineRule="auto"/>
@@ -7111,7 +7087,7 @@
           <w14:ligatures w14:val="none"/>
         </w:rPr>
       </w:pPr>
-      <w:hyperlink w:history="1" r:id="rId105">
+      <w:hyperlink w:history="1" r:id="rId135">
         <w:r>
           <w:rPr>
             <w:rFonts w:ascii="Segoe UI" w:cs="Segoe UI" w:eastAsia="Times New Roman" w:hAnsi="Segoe UI"/>
@@ -7121,9 +7097,186 @@
             <w:szCs w:val="22"/>
             <w14:ligatures w14:val="none"/>
           </w:rPr>
-          <w:t>Interrupted Time Series</w:t>
+          <w:t>Build the Model from the Hypothesis</w:t>
         </w:r>
       </w:hyperlink>
+    </w:p>
+    <w:p>
+      <w:pPr>
+        <w:numPr>
+          <w:ilvl w:val="0"/>
+          <w:numId w:val="23"/>
+        </w:numPr>
+        <w:shd w:color="auto" w:fill="FFFFFF" w:val="clear"/>
+        <w:spacing w:after="100" w:afterAutospacing="1" w:before="100" w:beforeAutospacing="1" w:line="240" w:lineRule="auto"/>
+        <w:rPr>
+          <w:rFonts w:ascii="Segoe UI" w:cs="Segoe UI" w:eastAsia="Times New Roman" w:hAnsi="Segoe UI"/>
+          <w:color w:val="1F2429"/>
+          <w:kern w:val="0"/>
+          <w:sz w:val="22"/>
+          <w:szCs w:val="22"/>
+          <w14:ligatures w14:val="none"/>
+        </w:rPr>
+      </w:pPr>
+      <w:hyperlink w:history="1" r:id="rId136">
+        <w:proofErr w:type="spellStart"/>
+        <w:r>
+          <w:rPr>
+            <w:rFonts w:ascii="Segoe UI" w:cs="Segoe UI" w:eastAsia="Times New Roman" w:hAnsi="Segoe UI"/>
+            <w:color w:val="1F2429"/>
+            <w:kern w:val="0"/>
+            <w:sz w:val="22"/>
+            <w:szCs w:val="22"/>
+            <w14:ligatures w14:val="none"/>
+          </w:rPr>
+          <w:t>Hypothesis testing with dummies</w:t>
+        </w:r>
+      </w:hyperlink>
+      <w:r>
+        <w:rPr>
+          <w:rFonts w:ascii="Segoe UI" w:cs="Segoe UI" w:eastAsia="Times New Roman" w:hAnsi="Segoe UI"/>
+          <w:color w:val="1F2429"/>
+          <w:kern w:val="0"/>
+          <w:sz w:val="22"/>
+          <w:szCs w:val="22"/>
+          <w14:ligatures w14:val="none"/>
+        </w:rPr>
+        <w:t xml:space="preserve"> </w:t>
+      </w:r>
+      <w:r>
+        <w:rPr>
+          <w:rFonts w:ascii="Segoe UI" w:cs="Segoe UI" w:eastAsia="Times New Roman" w:hAnsi="Segoe UI"/>
+          <w:b/>
+          <w:bCs/>
+          <w:caps/>
+          <w:color w:val="6D7681"/>
+          <w:spacing w:val="19"/>
+          <w:kern w:val="0"/>
+          <w:sz w:val="22"/>
+          <w:szCs w:val="22"/>
+          <w14:ligatures w14:val="none"/>
+        </w:rPr>
+        <w:t>Review</w:t>
+      </w:r>
+      <w:proofErr w:type="spellEnd"/>
+    </w:p>
+    <w:p>
+      <w:pPr>
+        <w:numPr>
+          <w:ilvl w:val="0"/>
+          <w:numId w:val="23"/>
+        </w:numPr>
+        <w:shd w:color="auto" w:fill="FFFFFF" w:val="clear"/>
+        <w:spacing w:after="100" w:afterAutospacing="1" w:before="100" w:beforeAutospacing="1" w:line="240" w:lineRule="auto"/>
+        <w:rPr>
+          <w:rFonts w:ascii="Segoe UI" w:cs="Segoe UI" w:eastAsia="Times New Roman" w:hAnsi="Segoe UI"/>
+          <w:color w:val="1F2429"/>
+          <w:kern w:val="0"/>
+          <w:sz w:val="22"/>
+          <w:szCs w:val="22"/>
+          <w14:ligatures w14:val="none"/>
+        </w:rPr>
+      </w:pPr>
+      <w:hyperlink w:history="1" r:id="rId137">
+        <w:proofErr w:type="spellStart"/>
+        <w:r>
+          <w:rPr>
+            <w:rFonts w:ascii="Segoe UI" w:cs="Segoe UI" w:eastAsia="Times New Roman" w:hAnsi="Segoe UI"/>
+            <w:color w:val="1F2429"/>
+            <w:kern w:val="0"/>
+            <w:sz w:val="22"/>
+            <w:szCs w:val="22"/>
+            <w14:ligatures w14:val="none"/>
+          </w:rPr>
+          <w:t>Interactions</w:t>
+        </w:r>
+      </w:hyperlink>
+      <w:r>
+        <w:rPr>
+          <w:rFonts w:ascii="Segoe UI" w:cs="Segoe UI" w:eastAsia="Times New Roman" w:hAnsi="Segoe UI"/>
+          <w:color w:val="1F2429"/>
+          <w:kern w:val="0"/>
+          <w:sz w:val="22"/>
+          <w:szCs w:val="22"/>
+          <w14:ligatures w14:val="none"/>
+        </w:rPr>
+        <w:t xml:space="preserve"> </w:t>
+      </w:r>
+      <w:r>
+        <w:rPr>
+          <w:rFonts w:ascii="Segoe UI" w:cs="Segoe UI" w:eastAsia="Times New Roman" w:hAnsi="Segoe UI"/>
+          <w:b/>
+          <w:bCs/>
+          <w:caps/>
+          <w:color w:val="6D7681"/>
+          <w:spacing w:val="19"/>
+          <w:kern w:val="0"/>
+          <w:sz w:val="22"/>
+          <w:szCs w:val="22"/>
+          <w14:ligatures w14:val="none"/>
+        </w:rPr>
+        <w:t>Review</w:t>
+      </w:r>
+      <w:proofErr w:type="spellEnd"/>
+    </w:p>
+    <w:p>
+      <w:pPr>
+        <w:numPr>
+          <w:ilvl w:val="0"/>
+          <w:numId w:val="23"/>
+        </w:numPr>
+        <w:shd w:color="auto" w:fill="FFFFFF" w:val="clear"/>
+        <w:spacing w:after="100" w:afterAutospacing="1" w:before="100" w:beforeAutospacing="1" w:line="240" w:lineRule="auto"/>
+        <w:rPr>
+          <w:rFonts w:ascii="Segoe UI" w:cs="Segoe UI" w:eastAsia="Times New Roman" w:hAnsi="Segoe UI"/>
+          <w:color w:val="1F2429"/>
+          <w:kern w:val="0"/>
+          <w:sz w:val="22"/>
+          <w:szCs w:val="22"/>
+          <w14:ligatures w14:val="none"/>
+        </w:rPr>
+      </w:pPr>
+      <w:hyperlink w:history="1" r:id="rId138">
+        <w:proofErr w:type="spellStart"/>
+        <w:r>
+          <w:rPr>
+            <w:rFonts w:ascii="Segoe UI" w:cs="Segoe UI" w:eastAsia="Times New Roman" w:hAnsi="Segoe UI"/>
+            <w:color w:val="1F2429"/>
+            <w:kern w:val="0"/>
+            <w:sz w:val="22"/>
+            <w:szCs w:val="22"/>
+            <w14:ligatures w14:val="none"/>
+          </w:rPr>
+          <w:t>Three estimators</w:t>
+        </w:r>
+      </w:hyperlink>
+      <w:r>
+        <w:rPr>
+          <w:rFonts w:ascii="Segoe UI" w:cs="Segoe UI" w:eastAsia="Times New Roman" w:hAnsi="Segoe UI"/>
+          <w:color w:val="1F2429"/>
+          <w:kern w:val="0"/>
+          <w:sz w:val="22"/>
+          <w:szCs w:val="22"/>
+          <w14:ligatures w14:val="none"/>
+        </w:rPr>
+        <w:t xml:space="preserve"> </w:t>
+      </w:r>
+      <w:r>
+        <w:rPr>
+          <w:rFonts w:ascii="Segoe UI" w:cs="Segoe UI" w:eastAsia="Times New Roman" w:hAnsi="Segoe UI"/>
+          <w:b/>
+          <w:bCs/>
+          <w:caps/>
+          <w:color w:val="6D7681"/>
+          <w:spacing w:val="19"/>
+          <w:kern w:val="0"/>
+          <w:sz w:val="22"/>
+          <w:szCs w:val="22"/>
+          <w14:ligatures w14:val="none"/>
+        </w:rPr>
+        <w:t>Review</w:t>
+      </w:r>
+      <w:proofErr w:type="spellEnd"/>
     </w:p>
     <w:p>
       <w:pPr>
@@ -7165,7 +7318,7 @@
       <w:pPr>
         <w:numPr>
           <w:ilvl w:val="0"/>
-          <w:numId w:val="28"/>
+          <w:numId w:val="24"/>
         </w:numPr>
         <w:shd w:color="auto" w:fill="FFFFFF" w:val="clear"/>
         <w:spacing w:after="100" w:afterAutospacing="1" w:before="100" w:beforeAutospacing="1" w:line="240" w:lineRule="auto"/>
@@ -7178,7 +7331,7 @@
           <w14:ligatures w14:val="none"/>
         </w:rPr>
       </w:pPr>
-      <w:hyperlink w:history="1" r:id="rId106">
+      <w:hyperlink w:history="1" r:id="rId139">
         <w:r>
           <w:rPr>
             <w:rFonts w:ascii="Segoe UI" w:cs="Segoe UI" w:eastAsia="Times New Roman" w:hAnsi="Segoe UI"/>
@@ -7188,7 +7341,7 @@
             <w:szCs w:val="22"/>
             <w14:ligatures w14:val="none"/>
           </w:rPr>
-          <w:t>Rent Control as a Time Series (Ch. 12)</w:t>
+          <w:t>Regression with Interaction Effects — practice questions</w:t>
         </w:r>
       </w:hyperlink>
       <w:r>
@@ -7211,38 +7364,14 @@
           <w:szCs w:val="22"/>
           <w14:ligatures w14:val="none"/>
         </w:rPr>
-        <w:t xml:space="preserve">Bingham &amp; Felbinger. A </w:t>
-      </w:r>
-      <w:proofErr w:type="gramStart"/>
-      <w:r>
-        <w:rPr>
-          <w:rFonts w:ascii="Segoe UI" w:cs="Segoe UI" w:eastAsia="Times New Roman" w:hAnsi="Segoe UI"/>
-          <w:color w:val="6D7681"/>
-          <w:kern w:val="0"/>
-          <w:sz w:val="22"/>
-          <w:szCs w:val="22"/>
-          <w14:ligatures w14:val="none"/>
-        </w:rPr>
-        <w:t>worked</w:t>
-      </w:r>
-      <w:proofErr w:type="gramEnd"/>
-      <w:r>
-        <w:rPr>
-          <w:rFonts w:ascii="Segoe UI" w:cs="Segoe UI" w:eastAsia="Times New Roman" w:hAnsi="Segoe UI"/>
-          <w:color w:val="6D7681"/>
-          <w:kern w:val="0"/>
-          <w:sz w:val="22"/>
-          <w:szCs w:val="22"/>
-          <w14:ligatures w14:val="none"/>
-        </w:rPr>
-        <w:t xml:space="preserve"> interrupted time series in policy.</w:t>
+        <w:t>The Unit 05 practice set, for a second pass at intercept and slope shifts.</w:t>
       </w:r>
     </w:p>
     <w:p>
       <w:pPr>
         <w:numPr>
           <w:ilvl w:val="0"/>
-          <w:numId w:val="28"/>
+          <w:numId w:val="24"/>
         </w:numPr>
         <w:shd w:color="auto" w:fill="FFFFFF" w:val="clear"/>
         <w:spacing w:after="100" w:afterAutospacing="1" w:before="100" w:beforeAutospacing="1" w:line="240" w:lineRule="auto"/>
@@ -7255,7 +7384,7 @@
           <w14:ligatures w14:val="none"/>
         </w:rPr>
       </w:pPr>
-      <w:hyperlink w:history="1" r:id="rId107">
+      <w:hyperlink w:history="1" r:id="rId140">
         <w:r>
           <w:rPr>
             <w:rFonts w:ascii="Segoe UI" w:cs="Segoe UI" w:eastAsia="Times New Roman" w:hAnsi="Segoe UI"/>
@@ -7265,9 +7394,50 @@
             <w:szCs w:val="22"/>
             <w14:ligatures w14:val="none"/>
           </w:rPr>
-          <w:t xml:space="preserve">NYC Robberies Occur as School Gets </w:t>
-        </w:r>
-        <w:proofErr w:type="spellStart"/>
+          <w:t>Regression with Interaction Effects — solutions</w:t>
+        </w:r>
+      </w:hyperlink>
+      <w:r>
+        <w:rPr>
+          <w:rFonts w:ascii="Segoe UI" w:cs="Segoe UI" w:eastAsia="Times New Roman" w:hAnsi="Segoe UI"/>
+          <w:color w:val="1F2429"/>
+          <w:kern w:val="0"/>
+          <w:sz w:val="22"/>
+          <w:szCs w:val="22"/>
+          <w14:ligatures w14:val="none"/>
+        </w:rPr>
+        <w:t xml:space="preserve"> </w:t>
+      </w:r>
+      <w:r>
+        <w:rPr>
+          <w:rFonts w:ascii="Segoe UI" w:cs="Segoe UI" w:eastAsia="Times New Roman" w:hAnsi="Segoe UI"/>
+          <w:color w:val="6D7681"/>
+          <w:kern w:val="0"/>
+          <w:sz w:val="22"/>
+          <w:szCs w:val="22"/>
+          <w14:ligatures w14:val="none"/>
+        </w:rPr>
+        <w:t>Check your answers here.</w:t>
+      </w:r>
+    </w:p>
+    <w:p>
+      <w:pPr>
+        <w:numPr>
+          <w:ilvl w:val="0"/>
+          <w:numId w:val="24"/>
+        </w:numPr>
+        <w:shd w:color="auto" w:fill="FFFFFF" w:val="clear"/>
+        <w:spacing w:after="100" w:afterAutospacing="1" w:before="100" w:beforeAutospacing="1" w:line="240" w:lineRule="auto"/>
+        <w:rPr>
+          <w:rFonts w:ascii="Segoe UI" w:cs="Segoe UI" w:eastAsia="Times New Roman" w:hAnsi="Segoe UI"/>
+          <w:color w:val="1F2429"/>
+          <w:kern w:val="0"/>
+          <w:sz w:val="22"/>
+          <w:szCs w:val="22"/>
+          <w14:ligatures w14:val="none"/>
+        </w:rPr>
+      </w:pPr>
+      <w:hyperlink w:history="1" r:id="rId141">
         <w:r>
           <w:rPr>
             <w:rFonts w:ascii="Segoe UI" w:cs="Segoe UI" w:eastAsia="Times New Roman" w:hAnsi="Segoe UI"/>
@@ -7277,7 +7447,7 @@
             <w:szCs w:val="22"/>
             <w14:ligatures w14:val="none"/>
           </w:rPr>
-          <w:t>Out</w:t>
+          <w:t>Difference-in-Difference Models</w:t>
         </w:r>
       </w:hyperlink>
       <w:r>
@@ -7300,19 +7470,7 @@
           <w:szCs w:val="22"/>
           <w14:ligatures w14:val="none"/>
         </w:rPr>
-        <w:t>A</w:t>
-      </w:r>
-      <w:proofErr w:type="spellEnd"/>
-      <w:r>
-        <w:rPr>
-          <w:rFonts w:ascii="Segoe UI" w:cs="Segoe UI" w:eastAsia="Times New Roman" w:hAnsi="Segoe UI"/>
-          <w:color w:val="6D7681"/>
-          <w:kern w:val="0"/>
-          <w:sz w:val="22"/>
-          <w:szCs w:val="22"/>
-          <w14:ligatures w14:val="none"/>
-        </w:rPr>
-        <w:t xml:space="preserve"> seasonality and cycle example worth reading alongside the lecture.</w:t>
+        <w:t>Handout. The 2 × 2 design written as an interaction, as in exercises 6 and 14.</w:t>
       </w:r>
     </w:p>
     <w:p>
@@ -7370,7 +7528,7 @@
         </w:rPr>
         <w:t xml:space="preserve"> </w:t>
       </w:r>
-      <w:hyperlink w:anchor="diff-in-diff" w:history="1" r:id="rId108">
+      <w:hyperlink w:anchor="interrupted-time-series" w:history="1" r:id="rId104">
         <w:r>
           <w:rPr>
             <w:rFonts w:ascii="Amasis MT Pro Black" w:cs="Segoe UI" w:eastAsia="Times New Roman" w:hAnsi="Amasis MT Pro Black"/>
@@ -7382,7 +7540,7 @@
             <w:szCs w:val="28"/>
             <w14:ligatures w14:val="none"/>
           </w:rPr>
-          <w:t>Difference-in-Difference Models</w:t>
+          <w:t>Interrupted Time Series</w:t>
         </w:r>
       </w:hyperlink>
     </w:p>
@@ -7408,7 +7566,31 @@
           <w:szCs w:val="22"/>
           <w14:ligatures w14:val="none"/>
         </w:rPr>
-        <w:t>Recasts the difference-in-difference estimator as a regression, where the coefficient on a group-by-period interaction is the program effect. The groups need not be equivalent at baseline, but they must have been trending in parallel before the intervention.</w:t>
+        <w:t xml:space="preserve">Models a single unit observed many times before and after an intervention, separating the pre-existing trend from what the policy changed. The model distinguishes an immediate change in level from a sustained change in </w:t>
+      </w:r>
+      <w:proofErr w:type="gramStart"/>
+      <w:r>
+        <w:rPr>
+          <w:rFonts w:ascii="Segoe UI" w:cs="Segoe UI" w:eastAsia="Times New Roman" w:hAnsi="Segoe UI"/>
+          <w:color w:val="4D565F"/>
+          <w:kern w:val="0"/>
+          <w:sz w:val="22"/>
+          <w:szCs w:val="22"/>
+          <w14:ligatures w14:val="none"/>
+        </w:rPr>
+        <w:t>slope, and</w:t>
+      </w:r>
+      <w:proofErr w:type="gramEnd"/>
+      <w:r>
+        <w:rPr>
+          <w:rFonts w:ascii="Segoe UI" w:cs="Segoe UI" w:eastAsia="Times New Roman" w:hAnsi="Segoe UI"/>
+          <w:color w:val="4D565F"/>
+          <w:kern w:val="0"/>
+          <w:sz w:val="22"/>
+          <w:szCs w:val="22"/>
+          <w14:ligatures w14:val="none"/>
+        </w:rPr>
+        <w:t xml:space="preserve"> checks the residuals for autocorrelation.</w:t>
       </w:r>
     </w:p>
     <w:p>
@@ -7451,7 +7633,7 @@
       <w:pPr>
         <w:numPr>
           <w:ilvl w:val="0"/>
-          <w:numId w:val="29"/>
+          <w:numId w:val="27"/>
         </w:numPr>
         <w:shd w:color="auto" w:fill="FFFFFF" w:val="clear"/>
         <w:spacing w:after="100" w:afterAutospacing="1" w:before="100" w:beforeAutospacing="1" w:line="240" w:lineRule="auto"/>
@@ -7464,7 +7646,7 @@
           <w14:ligatures w14:val="none"/>
         </w:rPr>
       </w:pPr>
-      <w:hyperlink w:history="1" r:id="rId109">
+      <w:hyperlink w:history="1" r:id="rId105">
         <w:r>
           <w:rPr>
             <w:rFonts w:ascii="Segoe UI" w:cs="Segoe UI" w:eastAsia="Times New Roman" w:hAnsi="Segoe UI"/>
@@ -7474,38 +7656,7 @@
             <w:szCs w:val="22"/>
             <w14:ligatures w14:val="none"/>
           </w:rPr>
-          <w:t>Difference-in-Difference Models</w:t>
-        </w:r>
-      </w:hyperlink>
-    </w:p>
-    <w:p>
-      <w:pPr>
-        <w:numPr>
-          <w:ilvl w:val="0"/>
-          <w:numId w:val="29"/>
-        </w:numPr>
-        <w:shd w:color="auto" w:fill="FFFFFF" w:val="clear"/>
-        <w:spacing w:after="100" w:afterAutospacing="1" w:before="100" w:beforeAutospacing="1" w:line="240" w:lineRule="auto"/>
-        <w:rPr>
-          <w:rFonts w:ascii="Segoe UI" w:cs="Segoe UI" w:eastAsia="Times New Roman" w:hAnsi="Segoe UI"/>
-          <w:color w:val="1F2429"/>
-          <w:kern w:val="0"/>
-          <w:sz w:val="22"/>
-          <w:szCs w:val="22"/>
-          <w14:ligatures w14:val="none"/>
-        </w:rPr>
-      </w:pPr>
-      <w:hyperlink w:history="1" r:id="rId110">
-        <w:r>
-          <w:rPr>
-            <w:rFonts w:ascii="Segoe UI" w:cs="Segoe UI" w:eastAsia="Times New Roman" w:hAnsi="Segoe UI"/>
-            <w:color w:val="1F2429"/>
-            <w:kern w:val="0"/>
-            <w:sz w:val="22"/>
-            <w:szCs w:val="22"/>
-            <w14:ligatures w14:val="none"/>
-          </w:rPr>
-          <w:t>Varieties of the Counterfactual</w:t>
+          <w:t>Interrupted Time Series</w:t>
         </w:r>
       </w:hyperlink>
     </w:p>
@@ -7549,7 +7700,7 @@
       <w:pPr>
         <w:numPr>
           <w:ilvl w:val="0"/>
-          <w:numId w:val="30"/>
+          <w:numId w:val="28"/>
         </w:numPr>
         <w:shd w:color="auto" w:fill="FFFFFF" w:val="clear"/>
         <w:spacing w:after="100" w:afterAutospacing="1" w:before="100" w:beforeAutospacing="1" w:line="240" w:lineRule="auto"/>
@@ -7562,7 +7713,7 @@
           <w14:ligatures w14:val="none"/>
         </w:rPr>
       </w:pPr>
-      <w:hyperlink w:history="1" r:id="rId111">
+      <w:hyperlink w:history="1" r:id="rId106">
         <w:r>
           <w:rPr>
             <w:rFonts w:ascii="Segoe UI" w:cs="Segoe UI" w:eastAsia="Times New Roman" w:hAnsi="Segoe UI"/>
@@ -7572,9 +7723,74 @@
             <w:szCs w:val="22"/>
             <w14:ligatures w14:val="none"/>
           </w:rPr>
-          <w:t xml:space="preserve">Designing Difference-in-Difference </w:t>
-        </w:r>
-        <w:proofErr w:type="spellStart"/>
+          <w:t>Rent Control as a Time Series (Ch. 12)</w:t>
+        </w:r>
+      </w:hyperlink>
+      <w:r>
+        <w:rPr>
+          <w:rFonts w:ascii="Segoe UI" w:cs="Segoe UI" w:eastAsia="Times New Roman" w:hAnsi="Segoe UI"/>
+          <w:color w:val="1F2429"/>
+          <w:kern w:val="0"/>
+          <w:sz w:val="22"/>
+          <w:szCs w:val="22"/>
+          <w14:ligatures w14:val="none"/>
+        </w:rPr>
+        <w:t xml:space="preserve"> </w:t>
+      </w:r>
+      <w:r>
+        <w:rPr>
+          <w:rFonts w:ascii="Segoe UI" w:cs="Segoe UI" w:eastAsia="Times New Roman" w:hAnsi="Segoe UI"/>
+          <w:color w:val="6D7681"/>
+          <w:kern w:val="0"/>
+          <w:sz w:val="22"/>
+          <w:szCs w:val="22"/>
+          <w14:ligatures w14:val="none"/>
+        </w:rPr>
+        <w:t xml:space="preserve">Bingham &amp; Felbinger. A </w:t>
+      </w:r>
+      <w:proofErr w:type="gramStart"/>
+      <w:r>
+        <w:rPr>
+          <w:rFonts w:ascii="Segoe UI" w:cs="Segoe UI" w:eastAsia="Times New Roman" w:hAnsi="Segoe UI"/>
+          <w:color w:val="6D7681"/>
+          <w:kern w:val="0"/>
+          <w:sz w:val="22"/>
+          <w:szCs w:val="22"/>
+          <w14:ligatures w14:val="none"/>
+        </w:rPr>
+        <w:t>worked</w:t>
+      </w:r>
+      <w:proofErr w:type="gramEnd"/>
+      <w:r>
+        <w:rPr>
+          <w:rFonts w:ascii="Segoe UI" w:cs="Segoe UI" w:eastAsia="Times New Roman" w:hAnsi="Segoe UI"/>
+          <w:color w:val="6D7681"/>
+          <w:kern w:val="0"/>
+          <w:sz w:val="22"/>
+          <w:szCs w:val="22"/>
+          <w14:ligatures w14:val="none"/>
+        </w:rPr>
+        <w:t xml:space="preserve"> interrupted time series in policy.</w:t>
+      </w:r>
+    </w:p>
+    <w:p>
+      <w:pPr>
+        <w:numPr>
+          <w:ilvl w:val="0"/>
+          <w:numId w:val="28"/>
+        </w:numPr>
+        <w:shd w:color="auto" w:fill="FFFFFF" w:val="clear"/>
+        <w:spacing w:after="100" w:afterAutospacing="1" w:before="100" w:beforeAutospacing="1" w:line="240" w:lineRule="auto"/>
+        <w:rPr>
+          <w:rFonts w:ascii="Segoe UI" w:cs="Segoe UI" w:eastAsia="Times New Roman" w:hAnsi="Segoe UI"/>
+          <w:color w:val="1F2429"/>
+          <w:kern w:val="0"/>
+          <w:sz w:val="22"/>
+          <w:szCs w:val="22"/>
+          <w14:ligatures w14:val="none"/>
+        </w:rPr>
+      </w:pPr>
+      <w:hyperlink w:history="1" r:id="rId107">
         <w:r>
           <w:rPr>
             <w:rFonts w:ascii="Segoe UI" w:cs="Segoe UI" w:eastAsia="Times New Roman" w:hAnsi="Segoe UI"/>
@@ -7584,62 +7800,9 @@
             <w:szCs w:val="22"/>
             <w14:ligatures w14:val="none"/>
           </w:rPr>
-          <w:t>Studies</w:t>
-        </w:r>
-      </w:hyperlink>
-      <w:r>
-        <w:rPr>
-          <w:rFonts w:ascii="Segoe UI" w:cs="Segoe UI" w:eastAsia="Times New Roman" w:hAnsi="Segoe UI"/>
-          <w:color w:val="1F2429"/>
-          <w:kern w:val="0"/>
-          <w:sz w:val="22"/>
-          <w:szCs w:val="22"/>
-          <w14:ligatures w14:val="none"/>
-        </w:rPr>
-        <w:t xml:space="preserve"> </w:t>
-      </w:r>
-      <w:r>
-        <w:rPr>
-          <w:rFonts w:ascii="Segoe UI" w:cs="Segoe UI" w:eastAsia="Times New Roman" w:hAnsi="Segoe UI"/>
-          <w:color w:val="6D7681"/>
-          <w:kern w:val="0"/>
-          <w:sz w:val="22"/>
-          <w:szCs w:val="22"/>
-          <w14:ligatures w14:val="none"/>
-        </w:rPr>
-        <w:t>Wing</w:t>
-      </w:r>
-      <w:proofErr w:type="spellEnd"/>
-      <w:r>
-        <w:rPr>
-          <w:rFonts w:ascii="Segoe UI" w:cs="Segoe UI" w:eastAsia="Times New Roman" w:hAnsi="Segoe UI"/>
-          <w:color w:val="6D7681"/>
-          <w:kern w:val="0"/>
-          <w:sz w:val="22"/>
-          <w:szCs w:val="22"/>
-          <w14:ligatures w14:val="none"/>
-        </w:rPr>
-        <w:t>, Simon &amp; Bello-Gomez (2018), Annual Review of Public Health.</w:t>
-      </w:r>
-    </w:p>
-    <w:p>
-      <w:pPr>
-        <w:numPr>
-          <w:ilvl w:val="0"/>
-          <w:numId w:val="30"/>
-        </w:numPr>
-        <w:shd w:color="auto" w:fill="FFFFFF" w:val="clear"/>
-        <w:spacing w:after="100" w:afterAutospacing="1" w:before="100" w:beforeAutospacing="1" w:line="240" w:lineRule="auto"/>
-        <w:rPr>
-          <w:rFonts w:ascii="Segoe UI" w:cs="Segoe UI" w:eastAsia="Times New Roman" w:hAnsi="Segoe UI"/>
-          <w:color w:val="1F2429"/>
-          <w:kern w:val="0"/>
-          <w:sz w:val="22"/>
-          <w:szCs w:val="22"/>
-          <w14:ligatures w14:val="none"/>
-        </w:rPr>
-      </w:pPr>
-      <w:hyperlink w:history="1" r:id="rId112">
+          <w:t xml:space="preserve">NYC Robberies Occur as School Gets </w:t>
+        </w:r>
+        <w:proofErr w:type="spellStart"/>
         <w:r>
           <w:rPr>
             <w:rFonts w:ascii="Segoe UI" w:cs="Segoe UI" w:eastAsia="Times New Roman" w:hAnsi="Segoe UI"/>
@@ -7649,7 +7812,7 @@
             <w:szCs w:val="22"/>
             <w14:ligatures w14:val="none"/>
           </w:rPr>
-          <w:t>Impact Evaluation in Practice, Ch. 7</w:t>
+          <w:t>Out</w:t>
         </w:r>
       </w:hyperlink>
       <w:r>
@@ -7672,95 +7835,6 @@
           <w:szCs w:val="22"/>
           <w14:ligatures w14:val="none"/>
         </w:rPr>
-        <w:t>Gertler et al. (2016), World Bank. Difference-in-differences.</w:t>
-      </w:r>
-    </w:p>
-    <w:p>
-      <w:pPr>
-        <w:numPr>
-          <w:ilvl w:val="0"/>
-          <w:numId w:val="30"/>
-        </w:numPr>
-        <w:shd w:color="auto" w:fill="FFFFFF" w:val="clear"/>
-        <w:spacing w:after="100" w:afterAutospacing="1" w:before="100" w:beforeAutospacing="1" w:line="240" w:lineRule="auto"/>
-        <w:rPr>
-          <w:rFonts w:ascii="Segoe UI" w:cs="Segoe UI" w:eastAsia="Times New Roman" w:hAnsi="Segoe UI"/>
-          <w:color w:val="1F2429"/>
-          <w:kern w:val="0"/>
-          <w:sz w:val="22"/>
-          <w:szCs w:val="22"/>
-          <w14:ligatures w14:val="none"/>
-        </w:rPr>
-      </w:pPr>
-      <w:hyperlink w:history="1" r:id="rId113">
-        <w:r>
-          <w:rPr>
-            <w:rFonts w:ascii="Segoe UI" w:cs="Segoe UI" w:eastAsia="Times New Roman" w:hAnsi="Segoe UI"/>
-            <w:color w:val="1F2429"/>
-            <w:kern w:val="0"/>
-            <w:sz w:val="22"/>
-            <w:szCs w:val="22"/>
-            <w14:ligatures w14:val="none"/>
-          </w:rPr>
-          <w:t xml:space="preserve">Shutdowns Prevented 60 </w:t>
-        </w:r>
-        <w:proofErr w:type="gramStart"/>
-        <w:r>
-          <w:rPr>
-            <w:rFonts w:ascii="Segoe UI" w:cs="Segoe UI" w:eastAsia="Times New Roman" w:hAnsi="Segoe UI"/>
-            <w:color w:val="1F2429"/>
-            <w:kern w:val="0"/>
-            <w:sz w:val="22"/>
-            <w:szCs w:val="22"/>
-            <w14:ligatures w14:val="none"/>
-          </w:rPr>
-          <w:t>Million</w:t>
-        </w:r>
-        <w:proofErr w:type="gramEnd"/>
-        <w:r>
-          <w:rPr>
-            <w:rFonts w:ascii="Segoe UI" w:cs="Segoe UI" w:eastAsia="Times New Roman" w:hAnsi="Segoe UI"/>
-            <w:color w:val="1F2429"/>
-            <w:kern w:val="0"/>
-            <w:sz w:val="22"/>
-            <w:szCs w:val="22"/>
-            <w14:ligatures w14:val="none"/>
-          </w:rPr>
-          <w:t xml:space="preserve"> Coronavirus </w:t>
-        </w:r>
-        <w:proofErr w:type="spellStart"/>
-        <w:r>
-          <w:rPr>
-            <w:rFonts w:ascii="Segoe UI" w:cs="Segoe UI" w:eastAsia="Times New Roman" w:hAnsi="Segoe UI"/>
-            <w:color w:val="1F2429"/>
-            <w:kern w:val="0"/>
-            <w:sz w:val="22"/>
-            <w:szCs w:val="22"/>
-            <w14:ligatures w14:val="none"/>
-          </w:rPr>
-          <w:t>Infections</w:t>
-        </w:r>
-      </w:hyperlink>
-      <w:r>
-        <w:rPr>
-          <w:rFonts w:ascii="Segoe UI" w:cs="Segoe UI" w:eastAsia="Times New Roman" w:hAnsi="Segoe UI"/>
-          <w:color w:val="1F2429"/>
-          <w:kern w:val="0"/>
-          <w:sz w:val="22"/>
-          <w:szCs w:val="22"/>
-          <w14:ligatures w14:val="none"/>
-        </w:rPr>
-        <w:t xml:space="preserve"> </w:t>
-      </w:r>
-      <w:r>
-        <w:rPr>
-          <w:rFonts w:ascii="Segoe UI" w:cs="Segoe UI" w:eastAsia="Times New Roman" w:hAnsi="Segoe UI"/>
-          <w:color w:val="6D7681"/>
-          <w:kern w:val="0"/>
-          <w:sz w:val="22"/>
-          <w:szCs w:val="22"/>
-          <w14:ligatures w14:val="none"/>
-        </w:rPr>
         <w:t>A</w:t>
       </w:r>
       <w:proofErr w:type="spellEnd"/>
@@ -7773,7 +7847,7 @@
           <w:szCs w:val="22"/>
           <w14:ligatures w14:val="none"/>
         </w:rPr>
-        <w:t xml:space="preserve"> high-profile diff-in-diff style policy claim to read critically.</w:t>
+        <w:t xml:space="preserve"> seasonality and cycle example worth reading alongside the lecture.</w:t>
       </w:r>
     </w:p>
     <w:p>
@@ -7831,7 +7905,7 @@
         </w:rPr>
         <w:t xml:space="preserve"> </w:t>
       </w:r>
-      <w:hyperlink w:anchor="fixed-effects" w:history="1" r:id="rId114">
+      <w:hyperlink w:anchor="diff-in-diff" w:history="1" r:id="rId108">
         <w:r>
           <w:rPr>
             <w:rFonts w:ascii="Amasis MT Pro Black" w:cs="Segoe UI" w:eastAsia="Times New Roman" w:hAnsi="Amasis MT Pro Black"/>
@@ -7843,7 +7917,7 @@
             <w:szCs w:val="28"/>
             <w14:ligatures w14:val="none"/>
           </w:rPr>
-          <w:t>Panel Data with Fixed Effects</w:t>
+          <w:t>Difference-in-Difference Models</w:t>
         </w:r>
       </w:hyperlink>
     </w:p>
@@ -7869,7 +7943,7 @@
           <w:szCs w:val="22"/>
           <w14:ligatures w14:val="none"/>
         </w:rPr>
-        <w:t>With repeated observations on the same units, fixed effects give each unit its own intercept, so nothing stable about a unit can confound the estimate. Compares pooled, random effects, and fixed effects specifications, and the tests that guide the choice among them.</w:t>
+        <w:t>Recasts the difference-in-difference estimator as a regression, where the coefficient on a group-by-period interaction is the program effect. The groups need not be equivalent at baseline, but they must have been trending in parallel before the intervention.</w:t>
       </w:r>
     </w:p>
     <w:p>
@@ -7912,7 +7986,7 @@
       <w:pPr>
         <w:numPr>
           <w:ilvl w:val="0"/>
-          <w:numId w:val="31"/>
+          <w:numId w:val="29"/>
         </w:numPr>
         <w:shd w:color="auto" w:fill="FFFFFF" w:val="clear"/>
         <w:spacing w:after="100" w:afterAutospacing="1" w:before="100" w:beforeAutospacing="1" w:line="240" w:lineRule="auto"/>
@@ -7925,7 +7999,7 @@
           <w14:ligatures w14:val="none"/>
         </w:rPr>
       </w:pPr>
-      <w:hyperlink w:history="1" r:id="rId115">
+      <w:hyperlink w:history="1" r:id="rId109">
         <w:r>
           <w:rPr>
             <w:rFonts w:ascii="Segoe UI" w:cs="Segoe UI" w:eastAsia="Times New Roman" w:hAnsi="Segoe UI"/>
@@ -7935,7 +8009,7 @@
             <w:szCs w:val="22"/>
             <w14:ligatures w14:val="none"/>
           </w:rPr>
-          <w:t>Fixed Effect Models</w:t>
+          <w:t>Difference-in-Difference Models</w:t>
         </w:r>
       </w:hyperlink>
     </w:p>
@@ -7943,7 +8017,7 @@
       <w:pPr>
         <w:numPr>
           <w:ilvl w:val="0"/>
-          <w:numId w:val="31"/>
+          <w:numId w:val="29"/>
         </w:numPr>
         <w:shd w:color="auto" w:fill="FFFFFF" w:val="clear"/>
         <w:spacing w:after="100" w:afterAutospacing="1" w:before="100" w:beforeAutospacing="1" w:line="240" w:lineRule="auto"/>
@@ -7956,7 +8030,7 @@
           <w14:ligatures w14:val="none"/>
         </w:rPr>
       </w:pPr>
-      <w:hyperlink w:history="1" r:id="rId116">
+      <w:hyperlink w:history="1" r:id="rId110">
         <w:r>
           <w:rPr>
             <w:rFonts w:ascii="Segoe UI" w:cs="Segoe UI" w:eastAsia="Times New Roman" w:hAnsi="Segoe UI"/>
@@ -7966,7 +8040,7 @@
             <w:szCs w:val="22"/>
             <w14:ligatures w14:val="none"/>
           </w:rPr>
-          <w:t>Panel Model Specification</w:t>
+          <w:t>Varieties of the Counterfactual</w:t>
         </w:r>
       </w:hyperlink>
     </w:p>
@@ -8010,7 +8084,7 @@
       <w:pPr>
         <w:numPr>
           <w:ilvl w:val="0"/>
-          <w:numId w:val="32"/>
+          <w:numId w:val="30"/>
         </w:numPr>
         <w:shd w:color="auto" w:fill="FFFFFF" w:val="clear"/>
         <w:spacing w:after="100" w:afterAutospacing="1" w:before="100" w:beforeAutospacing="1" w:line="240" w:lineRule="auto"/>
@@ -8023,7 +8097,7 @@
           <w14:ligatures w14:val="none"/>
         </w:rPr>
       </w:pPr>
-      <w:hyperlink w:history="1" r:id="rId117">
+      <w:hyperlink w:history="1" r:id="rId111">
         <w:r>
           <w:rPr>
             <w:rFonts w:ascii="Segoe UI" w:cs="Segoe UI" w:eastAsia="Times New Roman" w:hAnsi="Segoe UI"/>
@@ -8033,7 +8107,19 @@
             <w:szCs w:val="22"/>
             <w14:ligatures w14:val="none"/>
           </w:rPr>
-          <w:t>Impact Evaluation in Practice (World Bank)</w:t>
+          <w:t xml:space="preserve">Designing Difference-in-Difference </w:t>
+        </w:r>
+        <w:proofErr w:type="spellStart"/>
+        <w:r>
+          <w:rPr>
+            <w:rFonts w:ascii="Segoe UI" w:cs="Segoe UI" w:eastAsia="Times New Roman" w:hAnsi="Segoe UI"/>
+            <w:color w:val="1F2429"/>
+            <w:kern w:val="0"/>
+            <w:sz w:val="22"/>
+            <w:szCs w:val="22"/>
+            <w14:ligatures w14:val="none"/>
+          </w:rPr>
+          <w:t>Studies</w:t>
         </w:r>
       </w:hyperlink>
       <w:r>
@@ -8056,7 +8142,173 @@
           <w:szCs w:val="22"/>
           <w14:ligatures w14:val="none"/>
         </w:rPr>
-        <w:t>Reference text for panel designs.</w:t>
+        <w:t>Wing</w:t>
+      </w:r>
+      <w:proofErr w:type="spellEnd"/>
+      <w:r>
+        <w:rPr>
+          <w:rFonts w:ascii="Segoe UI" w:cs="Segoe UI" w:eastAsia="Times New Roman" w:hAnsi="Segoe UI"/>
+          <w:color w:val="6D7681"/>
+          <w:kern w:val="0"/>
+          <w:sz w:val="22"/>
+          <w:szCs w:val="22"/>
+          <w14:ligatures w14:val="none"/>
+        </w:rPr>
+        <w:t>, Simon &amp; Bello-Gomez (2018), Annual Review of Public Health.</w:t>
+      </w:r>
+    </w:p>
+    <w:p>
+      <w:pPr>
+        <w:numPr>
+          <w:ilvl w:val="0"/>
+          <w:numId w:val="30"/>
+        </w:numPr>
+        <w:shd w:color="auto" w:fill="FFFFFF" w:val="clear"/>
+        <w:spacing w:after="100" w:afterAutospacing="1" w:before="100" w:beforeAutospacing="1" w:line="240" w:lineRule="auto"/>
+        <w:rPr>
+          <w:rFonts w:ascii="Segoe UI" w:cs="Segoe UI" w:eastAsia="Times New Roman" w:hAnsi="Segoe UI"/>
+          <w:color w:val="1F2429"/>
+          <w:kern w:val="0"/>
+          <w:sz w:val="22"/>
+          <w:szCs w:val="22"/>
+          <w14:ligatures w14:val="none"/>
+        </w:rPr>
+      </w:pPr>
+      <w:hyperlink w:history="1" r:id="rId112">
+        <w:r>
+          <w:rPr>
+            <w:rFonts w:ascii="Segoe UI" w:cs="Segoe UI" w:eastAsia="Times New Roman" w:hAnsi="Segoe UI"/>
+            <w:color w:val="1F2429"/>
+            <w:kern w:val="0"/>
+            <w:sz w:val="22"/>
+            <w:szCs w:val="22"/>
+            <w14:ligatures w14:val="none"/>
+          </w:rPr>
+          <w:t>Impact Evaluation in Practice, Ch. 7</w:t>
+        </w:r>
+      </w:hyperlink>
+      <w:r>
+        <w:rPr>
+          <w:rFonts w:ascii="Segoe UI" w:cs="Segoe UI" w:eastAsia="Times New Roman" w:hAnsi="Segoe UI"/>
+          <w:color w:val="1F2429"/>
+          <w:kern w:val="0"/>
+          <w:sz w:val="22"/>
+          <w:szCs w:val="22"/>
+          <w14:ligatures w14:val="none"/>
+        </w:rPr>
+        <w:t xml:space="preserve"> </w:t>
+      </w:r>
+      <w:r>
+        <w:rPr>
+          <w:rFonts w:ascii="Segoe UI" w:cs="Segoe UI" w:eastAsia="Times New Roman" w:hAnsi="Segoe UI"/>
+          <w:color w:val="6D7681"/>
+          <w:kern w:val="0"/>
+          <w:sz w:val="22"/>
+          <w:szCs w:val="22"/>
+          <w14:ligatures w14:val="none"/>
+        </w:rPr>
+        <w:t>Gertler et al. (2016), World Bank. Difference-in-differences.</w:t>
+      </w:r>
+    </w:p>
+    <w:p>
+      <w:pPr>
+        <w:numPr>
+          <w:ilvl w:val="0"/>
+          <w:numId w:val="30"/>
+        </w:numPr>
+        <w:shd w:color="auto" w:fill="FFFFFF" w:val="clear"/>
+        <w:spacing w:after="100" w:afterAutospacing="1" w:before="100" w:beforeAutospacing="1" w:line="240" w:lineRule="auto"/>
+        <w:rPr>
+          <w:rFonts w:ascii="Segoe UI" w:cs="Segoe UI" w:eastAsia="Times New Roman" w:hAnsi="Segoe UI"/>
+          <w:color w:val="1F2429"/>
+          <w:kern w:val="0"/>
+          <w:sz w:val="22"/>
+          <w:szCs w:val="22"/>
+          <w14:ligatures w14:val="none"/>
+        </w:rPr>
+      </w:pPr>
+      <w:hyperlink w:history="1" r:id="rId113">
+        <w:r>
+          <w:rPr>
+            <w:rFonts w:ascii="Segoe UI" w:cs="Segoe UI" w:eastAsia="Times New Roman" w:hAnsi="Segoe UI"/>
+            <w:color w:val="1F2429"/>
+            <w:kern w:val="0"/>
+            <w:sz w:val="22"/>
+            <w:szCs w:val="22"/>
+            <w14:ligatures w14:val="none"/>
+          </w:rPr>
+          <w:t xml:space="preserve">Shutdowns Prevented 60 </w:t>
+        </w:r>
+        <w:proofErr w:type="gramStart"/>
+        <w:r>
+          <w:rPr>
+            <w:rFonts w:ascii="Segoe UI" w:cs="Segoe UI" w:eastAsia="Times New Roman" w:hAnsi="Segoe UI"/>
+            <w:color w:val="1F2429"/>
+            <w:kern w:val="0"/>
+            <w:sz w:val="22"/>
+            <w:szCs w:val="22"/>
+            <w14:ligatures w14:val="none"/>
+          </w:rPr>
+          <w:t>Million</w:t>
+        </w:r>
+        <w:proofErr w:type="gramEnd"/>
+        <w:r>
+          <w:rPr>
+            <w:rFonts w:ascii="Segoe UI" w:cs="Segoe UI" w:eastAsia="Times New Roman" w:hAnsi="Segoe UI"/>
+            <w:color w:val="1F2429"/>
+            <w:kern w:val="0"/>
+            <w:sz w:val="22"/>
+            <w:szCs w:val="22"/>
+            <w14:ligatures w14:val="none"/>
+          </w:rPr>
+          <w:t xml:space="preserve"> Coronavirus </w:t>
+        </w:r>
+        <w:proofErr w:type="spellStart"/>
+        <w:r>
+          <w:rPr>
+            <w:rFonts w:ascii="Segoe UI" w:cs="Segoe UI" w:eastAsia="Times New Roman" w:hAnsi="Segoe UI"/>
+            <w:color w:val="1F2429"/>
+            <w:kern w:val="0"/>
+            <w:sz w:val="22"/>
+            <w:szCs w:val="22"/>
+            <w14:ligatures w14:val="none"/>
+          </w:rPr>
+          <w:t>Infections</w:t>
+        </w:r>
+      </w:hyperlink>
+      <w:r>
+        <w:rPr>
+          <w:rFonts w:ascii="Segoe UI" w:cs="Segoe UI" w:eastAsia="Times New Roman" w:hAnsi="Segoe UI"/>
+          <w:color w:val="1F2429"/>
+          <w:kern w:val="0"/>
+          <w:sz w:val="22"/>
+          <w:szCs w:val="22"/>
+          <w14:ligatures w14:val="none"/>
+        </w:rPr>
+        <w:t xml:space="preserve"> </w:t>
+      </w:r>
+      <w:r>
+        <w:rPr>
+          <w:rFonts w:ascii="Segoe UI" w:cs="Segoe UI" w:eastAsia="Times New Roman" w:hAnsi="Segoe UI"/>
+          <w:color w:val="6D7681"/>
+          <w:kern w:val="0"/>
+          <w:sz w:val="22"/>
+          <w:szCs w:val="22"/>
+          <w14:ligatures w14:val="none"/>
+        </w:rPr>
+        <w:t>A</w:t>
+      </w:r>
+      <w:proofErr w:type="spellEnd"/>
+      <w:r>
+        <w:rPr>
+          <w:rFonts w:ascii="Segoe UI" w:cs="Segoe UI" w:eastAsia="Times New Roman" w:hAnsi="Segoe UI"/>
+          <w:color w:val="6D7681"/>
+          <w:kern w:val="0"/>
+          <w:sz w:val="22"/>
+          <w:szCs w:val="22"/>
+          <w14:ligatures w14:val="none"/>
+        </w:rPr>
+        <w:t xml:space="preserve"> high-profile diff-in-diff style policy claim to read critically.</w:t>
       </w:r>
     </w:p>
     <w:p>
@@ -8114,7 +8366,7 @@
         </w:rPr>
         <w:t xml:space="preserve"> </w:t>
       </w:r>
-      <w:hyperlink w:anchor="instrumental-variables" w:history="1" r:id="rId118">
+      <w:hyperlink w:anchor="fixed-effects" w:history="1" r:id="rId114">
         <w:r>
           <w:rPr>
             <w:rFonts w:ascii="Amasis MT Pro Black" w:cs="Segoe UI" w:eastAsia="Times New Roman" w:hAnsi="Amasis MT Pro Black"/>
@@ -8126,7 +8378,7 @@
             <w:szCs w:val="28"/>
             <w14:ligatures w14:val="none"/>
           </w:rPr>
-          <w:t>Instrumental Variables</w:t>
+          <w:t>Panel Data with Fixed Effects</w:t>
         </w:r>
       </w:hyperlink>
     </w:p>
@@ -8152,7 +8404,7 @@
           <w:szCs w:val="22"/>
           <w14:ligatures w14:val="none"/>
         </w:rPr>
-        <w:t>When the policy variable is correlated with the error term, OLS is biased no matter how much data you have. An instrument that moves the treatment but affects the outcome only through it recovers the effect, built step by step with two-stage least squares.</w:t>
+        <w:t>With repeated observations on the same units, fixed effects give each unit its own intercept, so nothing stable about a unit can confound the estimate. Compares pooled, random effects, and fixed effects specifications, and the tests that guide the choice among them.</w:t>
       </w:r>
     </w:p>
     <w:p>
@@ -8195,7 +8447,7 @@
       <w:pPr>
         <w:numPr>
           <w:ilvl w:val="0"/>
-          <w:numId w:val="33"/>
+          <w:numId w:val="31"/>
         </w:numPr>
         <w:shd w:color="auto" w:fill="FFFFFF" w:val="clear"/>
         <w:spacing w:after="100" w:afterAutospacing="1" w:before="100" w:beforeAutospacing="1" w:line="240" w:lineRule="auto"/>
@@ -8208,7 +8460,7 @@
           <w14:ligatures w14:val="none"/>
         </w:rPr>
       </w:pPr>
-      <w:hyperlink w:history="1" r:id="rId119">
+      <w:hyperlink w:history="1" r:id="rId115">
         <w:r>
           <w:rPr>
             <w:rFonts w:ascii="Segoe UI" w:cs="Segoe UI" w:eastAsia="Times New Roman" w:hAnsi="Segoe UI"/>
@@ -8218,7 +8470,38 @@
             <w:szCs w:val="22"/>
             <w14:ligatures w14:val="none"/>
           </w:rPr>
-          <w:t>Instrumental Variables</w:t>
+          <w:t>Fixed Effect Models</w:t>
+        </w:r>
+      </w:hyperlink>
+    </w:p>
+    <w:p>
+      <w:pPr>
+        <w:numPr>
+          <w:ilvl w:val="0"/>
+          <w:numId w:val="31"/>
+        </w:numPr>
+        <w:shd w:color="auto" w:fill="FFFFFF" w:val="clear"/>
+        <w:spacing w:after="100" w:afterAutospacing="1" w:before="100" w:beforeAutospacing="1" w:line="240" w:lineRule="auto"/>
+        <w:rPr>
+          <w:rFonts w:ascii="Segoe UI" w:cs="Segoe UI" w:eastAsia="Times New Roman" w:hAnsi="Segoe UI"/>
+          <w:color w:val="1F2429"/>
+          <w:kern w:val="0"/>
+          <w:sz w:val="22"/>
+          <w:szCs w:val="22"/>
+          <w14:ligatures w14:val="none"/>
+        </w:rPr>
+      </w:pPr>
+      <w:hyperlink w:history="1" r:id="rId116">
+        <w:r>
+          <w:rPr>
+            <w:rFonts w:ascii="Segoe UI" w:cs="Segoe UI" w:eastAsia="Times New Roman" w:hAnsi="Segoe UI"/>
+            <w:color w:val="1F2429"/>
+            <w:kern w:val="0"/>
+            <w:sz w:val="22"/>
+            <w:szCs w:val="22"/>
+            <w14:ligatures w14:val="none"/>
+          </w:rPr>
+          <w:t>Panel Model Specification</w:t>
         </w:r>
       </w:hyperlink>
     </w:p>
@@ -8262,7 +8545,7 @@
       <w:pPr>
         <w:numPr>
           <w:ilvl w:val="0"/>
-          <w:numId w:val="34"/>
+          <w:numId w:val="32"/>
         </w:numPr>
         <w:shd w:color="auto" w:fill="FFFFFF" w:val="clear"/>
         <w:spacing w:after="100" w:afterAutospacing="1" w:before="100" w:beforeAutospacing="1" w:line="240" w:lineRule="auto"/>
@@ -8275,7 +8558,7 @@
           <w14:ligatures w14:val="none"/>
         </w:rPr>
       </w:pPr>
-      <w:hyperlink w:history="1" r:id="rId120">
+      <w:hyperlink w:history="1" r:id="rId117">
         <w:r>
           <w:rPr>
             <w:rFonts w:ascii="Segoe UI" w:cs="Segoe UI" w:eastAsia="Times New Roman" w:hAnsi="Segoe UI"/>
@@ -8285,19 +8568,7 @@
             <w:szCs w:val="22"/>
             <w14:ligatures w14:val="none"/>
           </w:rPr>
-          <w:t xml:space="preserve">Causal Inference — What </w:t>
-        </w:r>
-        <w:proofErr w:type="spellStart"/>
-        <w:r>
-          <w:rPr>
-            <w:rFonts w:ascii="Segoe UI" w:cs="Segoe UI" w:eastAsia="Times New Roman" w:hAnsi="Segoe UI"/>
-            <w:color w:val="1F2429"/>
-            <w:kern w:val="0"/>
-            <w:sz w:val="22"/>
-            <w:szCs w:val="22"/>
-            <w14:ligatures w14:val="none"/>
-          </w:rPr>
-          <w:t>If</w:t>
+          <w:t>Impact Evaluation in Practice (World Bank)</w:t>
         </w:r>
       </w:hyperlink>
       <w:r>
@@ -8320,19 +8591,7 @@
           <w:szCs w:val="22"/>
           <w14:ligatures w14:val="none"/>
         </w:rPr>
-        <w:t>Hernán</w:t>
-      </w:r>
-      <w:proofErr w:type="spellEnd"/>
-      <w:r>
-        <w:rPr>
-          <w:rFonts w:ascii="Segoe UI" w:cs="Segoe UI" w:eastAsia="Times New Roman" w:hAnsi="Segoe UI"/>
-          <w:color w:val="6D7681"/>
-          <w:kern w:val="0"/>
-          <w:sz w:val="22"/>
-          <w:szCs w:val="22"/>
-          <w14:ligatures w14:val="none"/>
-        </w:rPr>
-        <w:t xml:space="preserve"> &amp; Robins. Reference text; the IV chapters are the relevant ones here.</w:t>
+        <w:t>Reference text for panel designs.</w:t>
       </w:r>
     </w:p>
     <w:p>
@@ -8390,7 +8649,7 @@
         </w:rPr>
         <w:t xml:space="preserve"> </w:t>
       </w:r>
-      <w:hyperlink w:anchor="regression-discontinuity" w:history="1" r:id="rId121">
+      <w:hyperlink w:anchor="instrumental-variables" w:history="1" r:id="rId118">
         <w:r>
           <w:rPr>
             <w:rFonts w:ascii="Amasis MT Pro Black" w:cs="Segoe UI" w:eastAsia="Times New Roman" w:hAnsi="Amasis MT Pro Black"/>
@@ -8402,7 +8661,7 @@
             <w:szCs w:val="28"/>
             <w14:ligatures w14:val="none"/>
           </w:rPr>
-          <w:t>Regression Discontinuity Design</w:t>
+          <w:t>Instrumental Variables</w:t>
         </w:r>
       </w:hyperlink>
     </w:p>
@@ -8428,7 +8687,7 @@
           <w:szCs w:val="22"/>
           <w14:ligatures w14:val="none"/>
         </w:rPr>
-        <w:t>When eligibility depends on crossing a cutoff, units just above and just below the threshold are nearly comparable, and the jump in outcomes at the cutoff is the program effect. The design is highly credible but local: it says little about units far from the threshold.</w:t>
+        <w:t>When the policy variable is correlated with the error term, OLS is biased no matter how much data you have. An instrument that moves the treatment but affects the outcome only through it recovers the effect, built step by step with two-stage least squares.</w:t>
       </w:r>
     </w:p>
     <w:p>
@@ -8471,7 +8730,7 @@
       <w:pPr>
         <w:numPr>
           <w:ilvl w:val="0"/>
-          <w:numId w:val="35"/>
+          <w:numId w:val="33"/>
         </w:numPr>
         <w:shd w:color="auto" w:fill="FFFFFF" w:val="clear"/>
         <w:spacing w:after="100" w:afterAutospacing="1" w:before="100" w:beforeAutospacing="1" w:line="240" w:lineRule="auto"/>
@@ -8484,7 +8743,7 @@
           <w14:ligatures w14:val="none"/>
         </w:rPr>
       </w:pPr>
-      <w:hyperlink w:history="1" r:id="rId122">
+      <w:hyperlink w:history="1" r:id="rId119">
         <w:r>
           <w:rPr>
             <w:rFonts w:ascii="Segoe UI" w:cs="Segoe UI" w:eastAsia="Times New Roman" w:hAnsi="Segoe UI"/>
@@ -8494,7 +8753,7 @@
             <w:szCs w:val="22"/>
             <w14:ligatures w14:val="none"/>
           </w:rPr>
-          <w:t>Regression Discontinuity Design</w:t>
+          <w:t>Instrumental Variables</w:t>
         </w:r>
       </w:hyperlink>
     </w:p>
@@ -8538,7 +8797,7 @@
       <w:pPr>
         <w:numPr>
           <w:ilvl w:val="0"/>
-          <w:numId w:val="36"/>
+          <w:numId w:val="34"/>
         </w:numPr>
         <w:shd w:color="auto" w:fill="FFFFFF" w:val="clear"/>
         <w:spacing w:after="100" w:afterAutospacing="1" w:before="100" w:beforeAutospacing="1" w:line="240" w:lineRule="auto"/>
@@ -8551,7 +8810,7 @@
           <w14:ligatures w14:val="none"/>
         </w:rPr>
       </w:pPr>
-      <w:hyperlink w:history="1" r:id="rId123">
+      <w:hyperlink w:history="1" r:id="rId120">
         <w:r>
           <w:rPr>
             <w:rFonts w:ascii="Segoe UI" w:cs="Segoe UI" w:eastAsia="Times New Roman" w:hAnsi="Segoe UI"/>
@@ -8561,7 +8820,19 @@
             <w:szCs w:val="22"/>
             <w14:ligatures w14:val="none"/>
           </w:rPr>
-          <w:t>Impact Evaluation in Practice, Ch. 5</w:t>
+          <w:t xml:space="preserve">Causal Inference — What </w:t>
+        </w:r>
+        <w:proofErr w:type="spellStart"/>
+        <w:r>
+          <w:rPr>
+            <w:rFonts w:ascii="Segoe UI" w:cs="Segoe UI" w:eastAsia="Times New Roman" w:hAnsi="Segoe UI"/>
+            <w:color w:val="1F2429"/>
+            <w:kern w:val="0"/>
+            <w:sz w:val="22"/>
+            <w:szCs w:val="22"/>
+            <w14:ligatures w14:val="none"/>
+          </w:rPr>
+          <w:t>If</w:t>
         </w:r>
       </w:hyperlink>
       <w:r>
@@ -8584,7 +8855,19 @@
           <w:szCs w:val="22"/>
           <w14:ligatures w14:val="none"/>
         </w:rPr>
-        <w:t>Gertler et al. (2016). Regression discontinuity design.</w:t>
+        <w:t>Hernán</w:t>
+      </w:r>
+      <w:proofErr w:type="spellEnd"/>
+      <w:r>
+        <w:rPr>
+          <w:rFonts w:ascii="Segoe UI" w:cs="Segoe UI" w:eastAsia="Times New Roman" w:hAnsi="Segoe UI"/>
+          <w:color w:val="6D7681"/>
+          <w:kern w:val="0"/>
+          <w:sz w:val="22"/>
+          <w:szCs w:val="22"/>
+          <w14:ligatures w14:val="none"/>
+        </w:rPr>
+        <w:t xml:space="preserve"> &amp; Robins. Reference text; the IV chapters are the relevant ones here.</w:t>
       </w:r>
     </w:p>
     <w:p>
@@ -8642,7 +8925,7 @@
         </w:rPr>
         <w:t xml:space="preserve"> </w:t>
       </w:r>
-      <w:hyperlink w:anchor="logistic-regression" w:history="1" r:id="rId124">
+      <w:hyperlink w:anchor="regression-discontinuity" w:history="1" r:id="rId121">
         <w:r>
           <w:rPr>
             <w:rFonts w:ascii="Amasis MT Pro Black" w:cs="Segoe UI" w:eastAsia="Times New Roman" w:hAnsi="Amasis MT Pro Black"/>
@@ -8654,7 +8937,7 @@
             <w:szCs w:val="28"/>
             <w14:ligatures w14:val="none"/>
           </w:rPr>
-          <w:t>Logistic Regression</w:t>
+          <w:t>Regression Discontinuity Design</w:t>
         </w:r>
       </w:hyperlink>
     </w:p>
@@ -8680,7 +8963,7 @@
           <w:szCs w:val="22"/>
           <w14:ligatures w14:val="none"/>
         </w:rPr>
-        <w:t>For yes-or-no outcomes, logistic regression keeps predicted probabilities between 0 and 1, at the cost of coefficients reported in log-odds. Converting to probabilities shows that the same change in X is worth different amounts depending on the starting point.</w:t>
+        <w:t>When eligibility depends on crossing a cutoff, units just above and just below the threshold are nearly comparable, and the jump in outcomes at the cutoff is the program effect. The design is highly credible but local: it says little about units far from the threshold.</w:t>
       </w:r>
     </w:p>
     <w:p>
@@ -8723,7 +9006,7 @@
       <w:pPr>
         <w:numPr>
           <w:ilvl w:val="0"/>
-          <w:numId w:val="37"/>
+          <w:numId w:val="35"/>
         </w:numPr>
         <w:shd w:color="auto" w:fill="FFFFFF" w:val="clear"/>
         <w:spacing w:after="100" w:afterAutospacing="1" w:before="100" w:beforeAutospacing="1" w:line="240" w:lineRule="auto"/>
@@ -8736,7 +9019,7 @@
           <w14:ligatures w14:val="none"/>
         </w:rPr>
       </w:pPr>
-      <w:hyperlink w:history="1" r:id="rId125">
+      <w:hyperlink w:history="1" r:id="rId122">
         <w:r>
           <w:rPr>
             <w:rFonts w:ascii="Segoe UI" w:cs="Segoe UI" w:eastAsia="Times New Roman" w:hAnsi="Segoe UI"/>
@@ -8746,7 +9029,7 @@
             <w:szCs w:val="22"/>
             <w14:ligatures w14:val="none"/>
           </w:rPr>
-          <w:t>Logistic Regression</w:t>
+          <w:t>Regression Discontinuity Design</w:t>
         </w:r>
       </w:hyperlink>
     </w:p>
@@ -8790,7 +9073,7 @@
       <w:pPr>
         <w:numPr>
           <w:ilvl w:val="0"/>
-          <w:numId w:val="38"/>
+          <w:numId w:val="36"/>
         </w:numPr>
         <w:shd w:color="auto" w:fill="FFFFFF" w:val="clear"/>
         <w:spacing w:after="100" w:afterAutospacing="1" w:before="100" w:beforeAutospacing="1" w:line="240" w:lineRule="auto"/>
@@ -8803,7 +9086,7 @@
           <w14:ligatures w14:val="none"/>
         </w:rPr>
       </w:pPr>
-      <w:hyperlink w:history="1" r:id="rId126">
+      <w:hyperlink w:history="1" r:id="rId123">
         <w:r>
           <w:rPr>
             <w:rFonts w:ascii="Segoe UI" w:cs="Segoe UI" w:eastAsia="Times New Roman" w:hAnsi="Segoe UI"/>
@@ -8813,19 +9096,7 @@
             <w:szCs w:val="22"/>
             <w14:ligatures w14:val="none"/>
           </w:rPr>
-          <w:t xml:space="preserve">Reporting Effect Sizes to Facilitate Cumulative </w:t>
-        </w:r>
-        <w:proofErr w:type="spellStart"/>
-        <w:r>
-          <w:rPr>
-            <w:rFonts w:ascii="Segoe UI" w:cs="Segoe UI" w:eastAsia="Times New Roman" w:hAnsi="Segoe UI"/>
-            <w:color w:val="1F2429"/>
-            <w:kern w:val="0"/>
-            <w:sz w:val="22"/>
-            <w:szCs w:val="22"/>
-            <w14:ligatures w14:val="none"/>
-          </w:rPr>
-          <w:t>Science</w:t>
+          <w:t>Impact Evaluation in Practice, Ch. 5</w:t>
         </w:r>
       </w:hyperlink>
       <w:r>
@@ -8848,120 +9119,7 @@
           <w:szCs w:val="22"/>
           <w14:ligatures w14:val="none"/>
         </w:rPr>
-        <w:t>On</w:t>
-      </w:r>
-      <w:proofErr w:type="spellEnd"/>
-      <w:r>
-        <w:rPr>
-          <w:rFonts w:ascii="Segoe UI" w:cs="Segoe UI" w:eastAsia="Times New Roman" w:hAnsi="Segoe UI"/>
-          <w:color w:val="6D7681"/>
-          <w:kern w:val="0"/>
-          <w:sz w:val="22"/>
-          <w:szCs w:val="22"/>
-          <w14:ligatures w14:val="none"/>
-        </w:rPr>
-        <w:t xml:space="preserve"> reporting effects in a way readers can </w:t>
-      </w:r>
-      <w:proofErr w:type="gramStart"/>
-      <w:r>
-        <w:rPr>
-          <w:rFonts w:ascii="Segoe UI" w:cs="Segoe UI" w:eastAsia="Times New Roman" w:hAnsi="Segoe UI"/>
-          <w:color w:val="6D7681"/>
-          <w:kern w:val="0"/>
-          <w:sz w:val="22"/>
-          <w:szCs w:val="22"/>
-          <w14:ligatures w14:val="none"/>
-        </w:rPr>
-        <w:t>actually use</w:t>
-      </w:r>
-      <w:proofErr w:type="gramEnd"/>
-      <w:r>
-        <w:rPr>
-          <w:rFonts w:ascii="Segoe UI" w:cs="Segoe UI" w:eastAsia="Times New Roman" w:hAnsi="Segoe UI"/>
-          <w:color w:val="6D7681"/>
-          <w:kern w:val="0"/>
-          <w:sz w:val="22"/>
-          <w:szCs w:val="22"/>
-          <w14:ligatures w14:val="none"/>
-        </w:rPr>
-        <w:t>.</w:t>
-      </w:r>
-    </w:p>
-    <w:p>
-      <w:pPr>
-        <w:numPr>
-          <w:ilvl w:val="0"/>
-          <w:numId w:val="38"/>
-        </w:numPr>
-        <w:shd w:color="auto" w:fill="FFFFFF" w:val="clear"/>
-        <w:spacing w:after="100" w:afterAutospacing="1" w:before="100" w:beforeAutospacing="1" w:line="240" w:lineRule="auto"/>
-        <w:rPr>
-          <w:rFonts w:ascii="Segoe UI" w:cs="Segoe UI" w:eastAsia="Times New Roman" w:hAnsi="Segoe UI"/>
-          <w:color w:val="1F2429"/>
-          <w:kern w:val="0"/>
-          <w:sz w:val="22"/>
-          <w:szCs w:val="22"/>
-          <w14:ligatures w14:val="none"/>
-        </w:rPr>
-      </w:pPr>
-      <w:hyperlink w:history="1" r:id="rId127">
-        <w:r>
-          <w:rPr>
-            <w:rFonts w:ascii="Segoe UI" w:cs="Segoe UI" w:eastAsia="Times New Roman" w:hAnsi="Segoe UI"/>
-            <w:color w:val="1F2429"/>
-            <w:kern w:val="0"/>
-            <w:sz w:val="22"/>
-            <w:szCs w:val="22"/>
-            <w14:ligatures w14:val="none"/>
-          </w:rPr>
-          <w:t xml:space="preserve">It's the Effect Size, </w:t>
-        </w:r>
-        <w:proofErr w:type="spellStart"/>
-        <w:r>
-          <w:rPr>
-            <w:rFonts w:ascii="Segoe UI" w:cs="Segoe UI" w:eastAsia="Times New Roman" w:hAnsi="Segoe UI"/>
-            <w:color w:val="1F2429"/>
-            <w:kern w:val="0"/>
-            <w:sz w:val="22"/>
-            <w:szCs w:val="22"/>
-            <w14:ligatures w14:val="none"/>
-          </w:rPr>
-          <w:t>Stupid</w:t>
-        </w:r>
-      </w:hyperlink>
-      <w:r>
-        <w:rPr>
-          <w:rFonts w:ascii="Segoe UI" w:cs="Segoe UI" w:eastAsia="Times New Roman" w:hAnsi="Segoe UI"/>
-          <w:color w:val="1F2429"/>
-          <w:kern w:val="0"/>
-          <w:sz w:val="22"/>
-          <w:szCs w:val="22"/>
-          <w14:ligatures w14:val="none"/>
-        </w:rPr>
-        <w:t xml:space="preserve"> </w:t>
-      </w:r>
-      <w:r>
-        <w:rPr>
-          <w:rFonts w:ascii="Segoe UI" w:cs="Segoe UI" w:eastAsia="Times New Roman" w:hAnsi="Segoe UI"/>
-          <w:color w:val="6D7681"/>
-          <w:kern w:val="0"/>
-          <w:sz w:val="22"/>
-          <w:szCs w:val="22"/>
-          <w14:ligatures w14:val="none"/>
-        </w:rPr>
-        <w:t>Coe</w:t>
-      </w:r>
-      <w:proofErr w:type="spellEnd"/>
-      <w:r>
-        <w:rPr>
-          <w:rFonts w:ascii="Segoe UI" w:cs="Segoe UI" w:eastAsia="Times New Roman" w:hAnsi="Segoe UI"/>
-          <w:color w:val="6D7681"/>
-          <w:kern w:val="0"/>
-          <w:sz w:val="22"/>
-          <w:szCs w:val="22"/>
-          <w14:ligatures w14:val="none"/>
-        </w:rPr>
-        <w:t>. Why the magnitude matters more than the p-value.</w:t>
+        <w:t>Gertler et al. (2016). Regression discontinuity design.</w:t>
       </w:r>
     </w:p>
     <w:p>
@@ -8991,6 +9149,383 @@
           <w14:ligatures w14:val="none"/>
         </w:rPr>
         <w:t>Unit 20</w:t>
+      </w:r>
+      <w:r>
+        <w:rPr>
+          <w:rFonts w:ascii="Amasis MT Pro Black" w:cs="Segoe UI" w:eastAsia="Times New Roman" w:hAnsi="Amasis MT Pro Black"/>
+          <w:b/>
+          <w:bCs/>
+          <w:caps/>
+          <w:color w:val="BD5416"/>
+          <w:spacing w:val="34"/>
+          <w:kern w:val="0"/>
+          <w:sz w:val="28"/>
+          <w:szCs w:val="28"/>
+          <w14:ligatures w14:val="none"/>
+        </w:rPr>
+        <w:t>:</w:t>
+      </w:r>
+      <w:r>
+        <w:rPr>
+          <w:rFonts w:ascii="Amasis MT Pro Black" w:cs="Segoe UI" w:eastAsia="Times New Roman" w:hAnsi="Amasis MT Pro Black"/>
+          <w:color w:val="BD5416"/>
+          <w:spacing w:val="34"/>
+          <w:kern w:val="0"/>
+          <w:sz w:val="28"/>
+          <w:szCs w:val="28"/>
+          <w14:ligatures w14:val="none"/>
+        </w:rPr>
+        <w:t xml:space="preserve"> </w:t>
+      </w:r>
+      <w:hyperlink w:anchor="logistic-regression" w:history="1" r:id="rId124">
+        <w:r>
+          <w:rPr>
+            <w:rFonts w:ascii="Amasis MT Pro Black" w:cs="Segoe UI" w:eastAsia="Times New Roman" w:hAnsi="Amasis MT Pro Black"/>
+            <w:b/>
+            <w:bCs/>
+            <w:color w:val="BD5416"/>
+            <w:kern w:val="0"/>
+            <w:sz w:val="28"/>
+            <w:szCs w:val="28"/>
+            <w14:ligatures w14:val="none"/>
+          </w:rPr>
+          <w:t>Logistic Regression</w:t>
+        </w:r>
+      </w:hyperlink>
+    </w:p>
+    <w:p>
+      <w:pPr>
+        <w:shd w:color="auto" w:fill="FFFFFF" w:val="clear"/>
+        <w:spacing w:after="100" w:afterAutospacing="1" w:before="100" w:beforeAutospacing="1" w:line="240" w:lineRule="auto"/>
+        <w:rPr>
+          <w:rFonts w:ascii="Segoe UI" w:cs="Segoe UI" w:eastAsia="Times New Roman" w:hAnsi="Segoe UI"/>
+          <w:color w:val="4D565F"/>
+          <w:kern w:val="0"/>
+          <w:sz w:val="22"/>
+          <w:szCs w:val="22"/>
+          <w14:ligatures w14:val="none"/>
+        </w:rPr>
+      </w:pPr>
+      <w:r>
+        <w:rPr>
+          <w:rFonts w:ascii="Segoe UI" w:cs="Segoe UI" w:eastAsia="Times New Roman" w:hAnsi="Segoe UI"/>
+          <w:color w:val="4D565F"/>
+          <w:kern w:val="0"/>
+          <w:sz w:val="22"/>
+          <w:szCs w:val="22"/>
+          <w14:ligatures w14:val="none"/>
+        </w:rPr>
+        <w:t>For yes-or-no outcomes, logistic regression keeps predicted probabilities between 0 and 1, at the cost of coefficients reported in log-odds. Converting to probabilities shows that the same change in X is worth different amounts depending on the starting point.</w:t>
+      </w:r>
+    </w:p>
+    <w:p>
+      <w:pPr>
+        <w:pBdr>
+          <w:bottom w:color="C3C8CF" w:space="0" w:sz="4" w:val="single"/>
+        </w:pBdr>
+        <w:shd w:color="auto" w:fill="FFFFFF" w:val="clear"/>
+        <w:spacing w:after="100" w:afterAutospacing="1" w:before="100" w:beforeAutospacing="1" w:line="240" w:lineRule="auto"/>
+        <w:rPr>
+          <w:rFonts w:ascii="Segoe UI" w:cs="Segoe UI" w:eastAsia="Times New Roman" w:hAnsi="Segoe UI"/>
+          <w:b/>
+          <w:bCs/>
+          <w:caps/>
+          <w:color w:val="6D7681"/>
+          <w:spacing w:val="34"/>
+          <w:kern w:val="0"/>
+          <w:sz w:val="24"/>
+          <w:szCs w:val="24"/>
+          <w14:ligatures w14:val="none"/>
+        </w:rPr>
+      </w:pPr>
+      <w:r>
+        <w:rPr>
+          <w:rFonts w:ascii="Segoe UI" w:cs="Segoe UI" w:eastAsia="Times New Roman" w:hAnsi="Segoe UI"/>
+          <w:b/>
+          <w:bCs/>
+          <w:caps/>
+          <w:color w:val="6D7681"/>
+          <w:spacing w:val="34"/>
+          <w:kern w:val="0"/>
+          <w:sz w:val="24"/>
+          <w:szCs w:val="24"/>
+          <w14:ligatures w14:val="none"/>
+        </w:rPr>
+        <w:t>Lectures</w:t>
+      </w:r>
+    </w:p>
+    <w:p>
+      <w:pPr>
+        <w:numPr>
+          <w:ilvl w:val="0"/>
+          <w:numId w:val="37"/>
+        </w:numPr>
+        <w:shd w:color="auto" w:fill="FFFFFF" w:val="clear"/>
+        <w:spacing w:after="100" w:afterAutospacing="1" w:before="100" w:beforeAutospacing="1" w:line="240" w:lineRule="auto"/>
+        <w:rPr>
+          <w:rFonts w:ascii="Segoe UI" w:cs="Segoe UI" w:eastAsia="Times New Roman" w:hAnsi="Segoe UI"/>
+          <w:color w:val="1F2429"/>
+          <w:kern w:val="0"/>
+          <w:sz w:val="22"/>
+          <w:szCs w:val="22"/>
+          <w14:ligatures w14:val="none"/>
+        </w:rPr>
+      </w:pPr>
+      <w:hyperlink w:history="1" r:id="rId125">
+        <w:r>
+          <w:rPr>
+            <w:rFonts w:ascii="Segoe UI" w:cs="Segoe UI" w:eastAsia="Times New Roman" w:hAnsi="Segoe UI"/>
+            <w:color w:val="1F2429"/>
+            <w:kern w:val="0"/>
+            <w:sz w:val="22"/>
+            <w:szCs w:val="22"/>
+            <w14:ligatures w14:val="none"/>
+          </w:rPr>
+          <w:t>Logistic Regression</w:t>
+        </w:r>
+      </w:hyperlink>
+    </w:p>
+    <w:p>
+      <w:pPr>
+        <w:pBdr>
+          <w:bottom w:color="C3C8CF" w:space="0" w:sz="4" w:val="single"/>
+        </w:pBdr>
+        <w:shd w:color="auto" w:fill="FFFFFF" w:val="clear"/>
+        <w:spacing w:after="100" w:afterAutospacing="1" w:before="100" w:beforeAutospacing="1" w:line="240" w:lineRule="auto"/>
+        <w:rPr>
+          <w:rFonts w:ascii="Segoe UI" w:cs="Segoe UI" w:eastAsia="Times New Roman" w:hAnsi="Segoe UI"/>
+          <w:b/>
+          <w:bCs/>
+          <w:caps/>
+          <w:color w:val="6D7681"/>
+          <w:spacing w:val="34"/>
+          <w:kern w:val="0"/>
+          <w:sz w:val="24"/>
+          <w:szCs w:val="24"/>
+          <w14:ligatures w14:val="none"/>
+        </w:rPr>
+      </w:pPr>
+      <w:r>
+        <w:rPr>
+          <w:rFonts w:ascii="Segoe UI" w:cs="Segoe UI" w:eastAsia="Times New Roman" w:hAnsi="Segoe UI"/>
+          <w:b/>
+          <w:bCs/>
+          <w:caps/>
+          <w:color w:val="6D7681"/>
+          <w:spacing w:val="34"/>
+          <w:kern w:val="0"/>
+          <w:sz w:val="24"/>
+          <w:szCs w:val="24"/>
+          <w14:ligatures w14:val="none"/>
+        </w:rPr>
+        <w:t>Reference material</w:t>
+      </w:r>
+    </w:p>
+    <w:p>
+      <w:pPr>
+        <w:numPr>
+          <w:ilvl w:val="0"/>
+          <w:numId w:val="38"/>
+        </w:numPr>
+        <w:shd w:color="auto" w:fill="FFFFFF" w:val="clear"/>
+        <w:spacing w:after="100" w:afterAutospacing="1" w:before="100" w:beforeAutospacing="1" w:line="240" w:lineRule="auto"/>
+        <w:rPr>
+          <w:rFonts w:ascii="Segoe UI" w:cs="Segoe UI" w:eastAsia="Times New Roman" w:hAnsi="Segoe UI"/>
+          <w:color w:val="1F2429"/>
+          <w:kern w:val="0"/>
+          <w:sz w:val="22"/>
+          <w:szCs w:val="22"/>
+          <w14:ligatures w14:val="none"/>
+        </w:rPr>
+      </w:pPr>
+      <w:hyperlink w:history="1" r:id="rId126">
+        <w:r>
+          <w:rPr>
+            <w:rFonts w:ascii="Segoe UI" w:cs="Segoe UI" w:eastAsia="Times New Roman" w:hAnsi="Segoe UI"/>
+            <w:color w:val="1F2429"/>
+            <w:kern w:val="0"/>
+            <w:sz w:val="22"/>
+            <w:szCs w:val="22"/>
+            <w14:ligatures w14:val="none"/>
+          </w:rPr>
+          <w:t xml:space="preserve">Reporting Effect Sizes to Facilitate Cumulative </w:t>
+        </w:r>
+        <w:proofErr w:type="spellStart"/>
+        <w:r>
+          <w:rPr>
+            <w:rFonts w:ascii="Segoe UI" w:cs="Segoe UI" w:eastAsia="Times New Roman" w:hAnsi="Segoe UI"/>
+            <w:color w:val="1F2429"/>
+            <w:kern w:val="0"/>
+            <w:sz w:val="22"/>
+            <w:szCs w:val="22"/>
+            <w14:ligatures w14:val="none"/>
+          </w:rPr>
+          <w:t>Science</w:t>
+        </w:r>
+      </w:hyperlink>
+      <w:r>
+        <w:rPr>
+          <w:rFonts w:ascii="Segoe UI" w:cs="Segoe UI" w:eastAsia="Times New Roman" w:hAnsi="Segoe UI"/>
+          <w:color w:val="1F2429"/>
+          <w:kern w:val="0"/>
+          <w:sz w:val="22"/>
+          <w:szCs w:val="22"/>
+          <w14:ligatures w14:val="none"/>
+        </w:rPr>
+        <w:t xml:space="preserve"> </w:t>
+      </w:r>
+      <w:r>
+        <w:rPr>
+          <w:rFonts w:ascii="Segoe UI" w:cs="Segoe UI" w:eastAsia="Times New Roman" w:hAnsi="Segoe UI"/>
+          <w:color w:val="6D7681"/>
+          <w:kern w:val="0"/>
+          <w:sz w:val="22"/>
+          <w:szCs w:val="22"/>
+          <w14:ligatures w14:val="none"/>
+        </w:rPr>
+        <w:t>On</w:t>
+      </w:r>
+      <w:proofErr w:type="spellEnd"/>
+      <w:r>
+        <w:rPr>
+          <w:rFonts w:ascii="Segoe UI" w:cs="Segoe UI" w:eastAsia="Times New Roman" w:hAnsi="Segoe UI"/>
+          <w:color w:val="6D7681"/>
+          <w:kern w:val="0"/>
+          <w:sz w:val="22"/>
+          <w:szCs w:val="22"/>
+          <w14:ligatures w14:val="none"/>
+        </w:rPr>
+        <w:t xml:space="preserve"> reporting effects in a way readers can </w:t>
+      </w:r>
+      <w:proofErr w:type="gramStart"/>
+      <w:r>
+        <w:rPr>
+          <w:rFonts w:ascii="Segoe UI" w:cs="Segoe UI" w:eastAsia="Times New Roman" w:hAnsi="Segoe UI"/>
+          <w:color w:val="6D7681"/>
+          <w:kern w:val="0"/>
+          <w:sz w:val="22"/>
+          <w:szCs w:val="22"/>
+          <w14:ligatures w14:val="none"/>
+        </w:rPr>
+        <w:t>actually use</w:t>
+      </w:r>
+      <w:proofErr w:type="gramEnd"/>
+      <w:r>
+        <w:rPr>
+          <w:rFonts w:ascii="Segoe UI" w:cs="Segoe UI" w:eastAsia="Times New Roman" w:hAnsi="Segoe UI"/>
+          <w:color w:val="6D7681"/>
+          <w:kern w:val="0"/>
+          <w:sz w:val="22"/>
+          <w:szCs w:val="22"/>
+          <w14:ligatures w14:val="none"/>
+        </w:rPr>
+        <w:t>.</w:t>
+      </w:r>
+    </w:p>
+    <w:p>
+      <w:pPr>
+        <w:numPr>
+          <w:ilvl w:val="0"/>
+          <w:numId w:val="38"/>
+        </w:numPr>
+        <w:shd w:color="auto" w:fill="FFFFFF" w:val="clear"/>
+        <w:spacing w:after="100" w:afterAutospacing="1" w:before="100" w:beforeAutospacing="1" w:line="240" w:lineRule="auto"/>
+        <w:rPr>
+          <w:rFonts w:ascii="Segoe UI" w:cs="Segoe UI" w:eastAsia="Times New Roman" w:hAnsi="Segoe UI"/>
+          <w:color w:val="1F2429"/>
+          <w:kern w:val="0"/>
+          <w:sz w:val="22"/>
+          <w:szCs w:val="22"/>
+          <w14:ligatures w14:val="none"/>
+        </w:rPr>
+      </w:pPr>
+      <w:hyperlink w:history="1" r:id="rId127">
+        <w:r>
+          <w:rPr>
+            <w:rFonts w:ascii="Segoe UI" w:cs="Segoe UI" w:eastAsia="Times New Roman" w:hAnsi="Segoe UI"/>
+            <w:color w:val="1F2429"/>
+            <w:kern w:val="0"/>
+            <w:sz w:val="22"/>
+            <w:szCs w:val="22"/>
+            <w14:ligatures w14:val="none"/>
+          </w:rPr>
+          <w:t xml:space="preserve">It's the Effect Size, </w:t>
+        </w:r>
+        <w:proofErr w:type="spellStart"/>
+        <w:r>
+          <w:rPr>
+            <w:rFonts w:ascii="Segoe UI" w:cs="Segoe UI" w:eastAsia="Times New Roman" w:hAnsi="Segoe UI"/>
+            <w:color w:val="1F2429"/>
+            <w:kern w:val="0"/>
+            <w:sz w:val="22"/>
+            <w:szCs w:val="22"/>
+            <w14:ligatures w14:val="none"/>
+          </w:rPr>
+          <w:t>Stupid</w:t>
+        </w:r>
+      </w:hyperlink>
+      <w:r>
+        <w:rPr>
+          <w:rFonts w:ascii="Segoe UI" w:cs="Segoe UI" w:eastAsia="Times New Roman" w:hAnsi="Segoe UI"/>
+          <w:color w:val="1F2429"/>
+          <w:kern w:val="0"/>
+          <w:sz w:val="22"/>
+          <w:szCs w:val="22"/>
+          <w14:ligatures w14:val="none"/>
+        </w:rPr>
+        <w:t xml:space="preserve"> </w:t>
+      </w:r>
+      <w:r>
+        <w:rPr>
+          <w:rFonts w:ascii="Segoe UI" w:cs="Segoe UI" w:eastAsia="Times New Roman" w:hAnsi="Segoe UI"/>
+          <w:color w:val="6D7681"/>
+          <w:kern w:val="0"/>
+          <w:sz w:val="22"/>
+          <w:szCs w:val="22"/>
+          <w14:ligatures w14:val="none"/>
+        </w:rPr>
+        <w:t>Coe</w:t>
+      </w:r>
+      <w:proofErr w:type="spellEnd"/>
+      <w:r>
+        <w:rPr>
+          <w:rFonts w:ascii="Segoe UI" w:cs="Segoe UI" w:eastAsia="Times New Roman" w:hAnsi="Segoe UI"/>
+          <w:color w:val="6D7681"/>
+          <w:kern w:val="0"/>
+          <w:sz w:val="22"/>
+          <w:szCs w:val="22"/>
+          <w14:ligatures w14:val="none"/>
+        </w:rPr>
+        <w:t>. Why the magnitude matters more than the p-value.</w:t>
+      </w:r>
+    </w:p>
+    <w:p>
+      <w:pPr>
+        <w:shd w:color="auto" w:fill="FFFFFF" w:val="clear"/>
+        <w:spacing w:after="0" w:line="240" w:lineRule="auto"/>
+        <w:rPr>
+          <w:rFonts w:ascii="Amasis MT Pro Black" w:cs="Segoe UI" w:eastAsia="Times New Roman" w:hAnsi="Amasis MT Pro Black"/>
+          <w:color w:val="1F2429"/>
+          <w:kern w:val="0"/>
+          <w:sz w:val="28"/>
+          <w:szCs w:val="28"/>
+          <w14:ligatures w14:val="none"/>
+        </w:rPr>
+      </w:pPr>
+      <w:r>
+        <w:rPr>
+          <w:rFonts w:ascii="Amasis MT Pro Black" w:cs="Segoe UI" w:eastAsia="Times New Roman" w:hAnsi="Amasis MT Pro Black"/>
+          <w:b/>
+          <w:bCs/>
+          <w:caps/>
+          <w:color w:val="BD5416"/>
+          <w:spacing w:val="34"/>
+          <w:kern w:val="0"/>
+          <w:sz w:val="28"/>
+          <w:szCs w:val="28"/>
+          <w14:ligatures w14:val="none"/>
+        </w:rPr>
+        <w:t>Unit 21</w:t>
       </w:r>
       <w:r>
         <w:rPr>

</xml_diff>